<commit_message>
Update Interview Practical ethics forms
</commit_message>
<xml_diff>
--- a/documents/practicals/DP_psychology_participant debrief_en.docx
+++ b/documents/practicals/DP_psychology_participant debrief_en.docx
@@ -1,25 +1,40 @@
 
 <file path=word/document.xml><?xml version="1.0" encoding="utf-8"?>
-<w:document xmlns:wpc="http://schemas.microsoft.com/office/word/2010/wordprocessingCanvas" xmlns:cx="http://schemas.microsoft.com/office/drawing/2014/chartex" xmlns:cx1="http://schemas.microsoft.com/office/drawing/2015/9/8/chartex" xmlns:cx2="http://schemas.microsoft.com/office/drawing/2015/10/21/chartex" xmlns:cx3="http://schemas.microsoft.com/office/drawing/2016/5/9/chartex" xmlns:cx4="http://schemas.microsoft.com/office/drawing/2016/5/10/chartex" xmlns:cx5="http://schemas.microsoft.com/office/drawing/2016/5/11/chartex" xmlns:cx6="http://schemas.microsoft.com/office/drawing/2016/5/12/chartex" xmlns:cx7="http://schemas.microsoft.com/office/drawing/2016/5/13/chartex" xmlns:cx8="http://schemas.microsoft.com/office/drawing/2016/5/14/chartex" xmlns:mc="http://schemas.openxmlformats.org/markup-compatibility/2006" xmlns:aink="http://schemas.microsoft.com/office/drawing/2016/ink" xmlns:am3d="http://schemas.microsoft.com/office/drawing/2017/model3d" xmlns:o="urn:schemas-microsoft-com:office:office" xmlns:oel="http://schemas.microsoft.com/office/2019/extlst" xmlns:r="http://schemas.openxmlformats.org/officeDocument/2006/relationships" xmlns:m="http://schemas.openxmlformats.org/officeDocument/2006/math" xmlns:v="urn:schemas-microsoft-com:vml" xmlns:wp14="http://schemas.microsoft.com/office/word/2010/wordprocessingDrawing" xmlns:wp="http://schemas.openxmlformats.org/drawingml/2006/wordprocessingDrawing" xmlns:w10="urn:schemas-microsoft-com:office:word" xmlns:w="http://schemas.openxmlformats.org/wordprocessingml/2006/main" xmlns:w14="http://schemas.microsoft.com/office/word/2010/wordml" xmlns:w15="http://schemas.microsoft.com/office/word/2012/wordml" xmlns:w16cex="http://schemas.microsoft.com/office/word/2018/wordml/cex" xmlns:w16cid="http://schemas.microsoft.com/office/word/2016/wordml/cid" xmlns:w16="http://schemas.microsoft.com/office/word/2018/wordml" xmlns:w16du="http://schemas.microsoft.com/office/word/2023/wordml/word16du" xmlns:w16sdtdh="http://schemas.microsoft.com/office/word/2020/wordml/sdtdatahash" xmlns:w16se="http://schemas.microsoft.com/office/word/2015/wordml/symex" xmlns:wpg="http://schemas.microsoft.com/office/word/2010/wordprocessingGroup" xmlns:wpi="http://schemas.microsoft.com/office/word/2010/wordprocessingInk" xmlns:wne="http://schemas.microsoft.com/office/word/2006/wordml" xmlns:wps="http://schemas.microsoft.com/office/word/2010/wordprocessingShape" mc:Ignorable="w14 w15 w16se w16cid w16 w16cex w16sdtdh w16du wp14">
+<w:document xmlns:wpc="http://schemas.microsoft.com/office/word/2010/wordprocessingCanvas" xmlns:cx="http://schemas.microsoft.com/office/drawing/2014/chartex" xmlns:cx1="http://schemas.microsoft.com/office/drawing/2015/9/8/chartex" xmlns:cx2="http://schemas.microsoft.com/office/drawing/2015/10/21/chartex" xmlns:cx3="http://schemas.microsoft.com/office/drawing/2016/5/9/chartex" xmlns:cx4="http://schemas.microsoft.com/office/drawing/2016/5/10/chartex" xmlns:cx5="http://schemas.microsoft.com/office/drawing/2016/5/11/chartex" xmlns:cx6="http://schemas.microsoft.com/office/drawing/2016/5/12/chartex" xmlns:cx7="http://schemas.microsoft.com/office/drawing/2016/5/13/chartex" xmlns:cx8="http://schemas.microsoft.com/office/drawing/2016/5/14/chartex" xmlns:mc="http://schemas.openxmlformats.org/markup-compatibility/2006" xmlns:aink="http://schemas.microsoft.com/office/drawing/2016/ink" xmlns:am3d="http://schemas.microsoft.com/office/drawing/2017/model3d" xmlns:o="urn:schemas-microsoft-com:office:office" xmlns:oel="http://schemas.microsoft.com/office/2019/extlst" xmlns:r="http://schemas.openxmlformats.org/officeDocument/2006/relationships" xmlns:m="http://schemas.openxmlformats.org/officeDocument/2006/math" xmlns:v="urn:schemas-microsoft-com:vml" xmlns:wp14="http://schemas.microsoft.com/office/word/2010/wordprocessingDrawing" xmlns:wp="http://schemas.openxmlformats.org/drawingml/2006/wordprocessingDrawing" xmlns:w10="urn:schemas-microsoft-com:office:word" xmlns:w="http://schemas.openxmlformats.org/wordprocessingml/2006/main" xmlns:w14="http://schemas.microsoft.com/office/word/2010/wordml" xmlns:w15="http://schemas.microsoft.com/office/word/2012/wordml" xmlns:w16cex="http://schemas.microsoft.com/office/word/2018/wordml/cex" xmlns:w16cid="http://schemas.microsoft.com/office/word/2016/wordml/cid" xmlns:w16="http://schemas.microsoft.com/office/word/2018/wordml" xmlns:w16du="http://schemas.microsoft.com/office/word/2023/wordml/word16du" xmlns:w16sdtdh="http://schemas.microsoft.com/office/word/2020/wordml/sdtdatahash" xmlns:w16sdtfl="http://schemas.microsoft.com/office/word/2024/wordml/sdtformatlock" xmlns:w16se="http://schemas.microsoft.com/office/word/2015/wordml/symex" xmlns:wpg="http://schemas.microsoft.com/office/word/2010/wordprocessingGroup" xmlns:wpi="http://schemas.microsoft.com/office/word/2010/wordprocessingInk" xmlns:wne="http://schemas.microsoft.com/office/word/2006/wordml" xmlns:wps="http://schemas.microsoft.com/office/word/2010/wordprocessingShape" mc:Ignorable="w14 w15 w16se w16cid w16 w16cex w16sdtdh w16sdtfl w16du wp14">
   <w:body>
     <w:p>
       <w:pPr>
         <w:pStyle w:val="Heading3"/>
-      </w:pPr>
-      <w:proofErr w:type="gramStart"/>
+        <w:rPr>
+          <w:color w:val="auto"/>
+        </w:rPr>
+      </w:pPr>
       <w:r>
         <w:rPr>
           <w:rFonts w:eastAsia="Calibri"/>
+          <w:color w:val="auto"/>
         </w:rPr>
-        <w:t>Participant</w:t>
+        <w:t xml:space="preserve">Participant </w:t>
       </w:r>
-      <w:proofErr w:type="gramEnd"/>
       <w:r>
         <w:rPr>
           <w:rFonts w:eastAsia="Calibri"/>
+          <w:color w:val="auto"/>
         </w:rPr>
-        <w:t xml:space="preserve"> debrief</w:t>
+        <w:t>D</w:t>
       </w:r>
+      <w:r>
+        <w:rPr>
+          <w:rFonts w:eastAsia="Calibri"/>
+          <w:color w:val="auto"/>
+        </w:rPr>
+        <w:t>ebrief</w:t>
+      </w:r>
+    </w:p>
+    <w:p>
+      <w:pPr>
+        <w:pStyle w:val="Body"/>
+      </w:pPr>
     </w:p>
     <w:p>
       <w:pPr>
@@ -112,48 +127,7 @@
               <w:pStyle w:val="Body"/>
             </w:pPr>
             <w:r>
-              <w:t xml:space="preserve">The findings were: </w:t>
-            </w:r>
-          </w:p>
-        </w:tc>
-      </w:tr>
-      <w:tr>
-        <w:tc>
-          <w:tcPr>
-            <w:tcW w:w="9016" w:type="dxa"/>
-          </w:tcPr>
-          <w:p>
-            <w:pPr>
-              <w:pStyle w:val="Body"/>
-            </w:pPr>
-          </w:p>
-          <w:p>
-            <w:pPr>
-              <w:pStyle w:val="Body"/>
-            </w:pPr>
-          </w:p>
-        </w:tc>
-      </w:tr>
-      <w:tr>
-        <w:tc>
-          <w:tcPr>
-            <w:tcW w:w="9016" w:type="dxa"/>
-          </w:tcPr>
-          <w:p>
-            <w:pPr>
-              <w:pStyle w:val="Body"/>
-            </w:pPr>
-            <w:r>
-              <w:t xml:space="preserve">The expectations </w:t>
-            </w:r>
-            <w:r>
-              <w:t xml:space="preserve">were that </w:t>
-            </w:r>
-            <w:r>
-              <w:t>the study w</w:t>
-            </w:r>
-            <w:r>
-              <w:t>ould find:</w:t>
+              <w:t>Our prediction was based on the following psychological theory or previous research:</w:t>
             </w:r>
           </w:p>
         </w:tc>
@@ -213,6 +187,68 @@
           </w:p>
         </w:tc>
       </w:tr>
+      <w:tr>
+        <w:tc>
+          <w:tcPr>
+            <w:tcW w:w="9016" w:type="dxa"/>
+          </w:tcPr>
+          <w:p>
+            <w:pPr>
+              <w:pStyle w:val="Body"/>
+              <w:rPr>
+                <w:lang w:val="en-US"/>
+              </w:rPr>
+            </w:pPr>
+            <w:r>
+              <w:rPr>
+                <w:lang w:val="en-US"/>
+              </w:rPr>
+              <w:t xml:space="preserve">The information collected during this interview will be </w:t>
+            </w:r>
+            <w:r>
+              <w:rPr>
+                <w:lang w:val="en-US"/>
+              </w:rPr>
+              <w:t>analyzed</w:t>
+            </w:r>
+            <w:r>
+              <w:rPr>
+                <w:lang w:val="en-US"/>
+              </w:rPr>
+              <w:t xml:space="preserve"> later. If you would like to know the findings once the study is </w:t>
+            </w:r>
+            <w:r>
+              <w:rPr>
+                <w:lang w:val="en-US"/>
+              </w:rPr>
+              <w:t>complete or</w:t>
+            </w:r>
+            <w:r>
+              <w:rPr>
+                <w:lang w:val="en-US"/>
+              </w:rPr>
+              <w:t xml:space="preserve"> wish to have your data withdrawn and deleted before analysis, please contact us. If any part of the interview has caused you discomfort or distress, please inform the researcher or your teacher.</w:t>
+            </w:r>
+          </w:p>
+        </w:tc>
+      </w:tr>
+      <w:tr>
+        <w:tc>
+          <w:tcPr>
+            <w:tcW w:w="9016" w:type="dxa"/>
+          </w:tcPr>
+          <w:p>
+            <w:pPr>
+              <w:pStyle w:val="Body"/>
+            </w:pPr>
+          </w:p>
+          <w:p>
+            <w:pPr>
+              <w:pStyle w:val="Body"/>
+            </w:pPr>
+          </w:p>
+        </w:tc>
+      </w:tr>
     </w:tbl>
     <w:p>
       <w:pPr>
@@ -222,6 +258,7 @@
     <w:p>
       <w:pPr>
         <w:pStyle w:val="Body"/>
+        <w:spacing w:line="360" w:lineRule="auto"/>
       </w:pPr>
       <w:r>
         <w:t xml:space="preserve">This is the contact if you </w:t>
@@ -230,7 +267,7 @@
         <w:t>would like to know more about our study’s findings or the theory on which it is based</w:t>
       </w:r>
       <w:r>
-        <w:t>.</w:t>
+        <w:t>: [Insert contact info here]</w:t>
       </w:r>
     </w:p>
     <w:p>
@@ -242,6 +279,9 @@
       </w:pPr>
       <w:r>
         <w:t>___________________</w:t>
+      </w:r>
+      <w:r>
+        <w:t>__________________________________________________________________</w:t>
       </w:r>
     </w:p>
     <w:p>
@@ -282,7 +322,7 @@
 </file>
 
 <file path=word/endnotes.xml><?xml version="1.0" encoding="utf-8"?>
-<w:endnotes xmlns:wpc="http://schemas.microsoft.com/office/word/2010/wordprocessingCanvas" xmlns:cx="http://schemas.microsoft.com/office/drawing/2014/chartex" xmlns:cx1="http://schemas.microsoft.com/office/drawing/2015/9/8/chartex" xmlns:cx2="http://schemas.microsoft.com/office/drawing/2015/10/21/chartex" xmlns:cx3="http://schemas.microsoft.com/office/drawing/2016/5/9/chartex" xmlns:cx4="http://schemas.microsoft.com/office/drawing/2016/5/10/chartex" xmlns:cx5="http://schemas.microsoft.com/office/drawing/2016/5/11/chartex" xmlns:cx6="http://schemas.microsoft.com/office/drawing/2016/5/12/chartex" xmlns:cx7="http://schemas.microsoft.com/office/drawing/2016/5/13/chartex" xmlns:cx8="http://schemas.microsoft.com/office/drawing/2016/5/14/chartex" xmlns:mc="http://schemas.openxmlformats.org/markup-compatibility/2006" xmlns:aink="http://schemas.microsoft.com/office/drawing/2016/ink" xmlns:am3d="http://schemas.microsoft.com/office/drawing/2017/model3d" xmlns:o="urn:schemas-microsoft-com:office:office" xmlns:oel="http://schemas.microsoft.com/office/2019/extlst" xmlns:r="http://schemas.openxmlformats.org/officeDocument/2006/relationships" xmlns:m="http://schemas.openxmlformats.org/officeDocument/2006/math" xmlns:v="urn:schemas-microsoft-com:vml" xmlns:wp14="http://schemas.microsoft.com/office/word/2010/wordprocessingDrawing" xmlns:wp="http://schemas.openxmlformats.org/drawingml/2006/wordprocessingDrawing" xmlns:w10="urn:schemas-microsoft-com:office:word" xmlns:w="http://schemas.openxmlformats.org/wordprocessingml/2006/main" xmlns:w14="http://schemas.microsoft.com/office/word/2010/wordml" xmlns:w15="http://schemas.microsoft.com/office/word/2012/wordml" xmlns:w16cex="http://schemas.microsoft.com/office/word/2018/wordml/cex" xmlns:w16cid="http://schemas.microsoft.com/office/word/2016/wordml/cid" xmlns:w16="http://schemas.microsoft.com/office/word/2018/wordml" xmlns:w16du="http://schemas.microsoft.com/office/word/2023/wordml/word16du" xmlns:w16sdtdh="http://schemas.microsoft.com/office/word/2020/wordml/sdtdatahash" xmlns:w16se="http://schemas.microsoft.com/office/word/2015/wordml/symex" xmlns:wpg="http://schemas.microsoft.com/office/word/2010/wordprocessingGroup" xmlns:wpi="http://schemas.microsoft.com/office/word/2010/wordprocessingInk" xmlns:wne="http://schemas.microsoft.com/office/word/2006/wordml" xmlns:wps="http://schemas.microsoft.com/office/word/2010/wordprocessingShape" mc:Ignorable="w14 w15 w16se w16cid w16 w16cex w16sdtdh w16du wp14">
+<w:endnotes xmlns:wpc="http://schemas.microsoft.com/office/word/2010/wordprocessingCanvas" xmlns:cx="http://schemas.microsoft.com/office/drawing/2014/chartex" xmlns:cx1="http://schemas.microsoft.com/office/drawing/2015/9/8/chartex" xmlns:cx2="http://schemas.microsoft.com/office/drawing/2015/10/21/chartex" xmlns:cx3="http://schemas.microsoft.com/office/drawing/2016/5/9/chartex" xmlns:cx4="http://schemas.microsoft.com/office/drawing/2016/5/10/chartex" xmlns:cx5="http://schemas.microsoft.com/office/drawing/2016/5/11/chartex" xmlns:cx6="http://schemas.microsoft.com/office/drawing/2016/5/12/chartex" xmlns:cx7="http://schemas.microsoft.com/office/drawing/2016/5/13/chartex" xmlns:cx8="http://schemas.microsoft.com/office/drawing/2016/5/14/chartex" xmlns:mc="http://schemas.openxmlformats.org/markup-compatibility/2006" xmlns:aink="http://schemas.microsoft.com/office/drawing/2016/ink" xmlns:am3d="http://schemas.microsoft.com/office/drawing/2017/model3d" xmlns:o="urn:schemas-microsoft-com:office:office" xmlns:oel="http://schemas.microsoft.com/office/2019/extlst" xmlns:r="http://schemas.openxmlformats.org/officeDocument/2006/relationships" xmlns:m="http://schemas.openxmlformats.org/officeDocument/2006/math" xmlns:v="urn:schemas-microsoft-com:vml" xmlns:wp14="http://schemas.microsoft.com/office/word/2010/wordprocessingDrawing" xmlns:wp="http://schemas.openxmlformats.org/drawingml/2006/wordprocessingDrawing" xmlns:w10="urn:schemas-microsoft-com:office:word" xmlns:w="http://schemas.openxmlformats.org/wordprocessingml/2006/main" xmlns:w14="http://schemas.microsoft.com/office/word/2010/wordml" xmlns:w15="http://schemas.microsoft.com/office/word/2012/wordml" xmlns:w16cex="http://schemas.microsoft.com/office/word/2018/wordml/cex" xmlns:w16cid="http://schemas.microsoft.com/office/word/2016/wordml/cid" xmlns:w16="http://schemas.microsoft.com/office/word/2018/wordml" xmlns:w16du="http://schemas.microsoft.com/office/word/2023/wordml/word16du" xmlns:w16sdtdh="http://schemas.microsoft.com/office/word/2020/wordml/sdtdatahash" xmlns:w16sdtfl="http://schemas.microsoft.com/office/word/2024/wordml/sdtformatlock" xmlns:w16se="http://schemas.microsoft.com/office/word/2015/wordml/symex" xmlns:wpg="http://schemas.microsoft.com/office/word/2010/wordprocessingGroup" xmlns:wpi="http://schemas.microsoft.com/office/word/2010/wordprocessingInk" xmlns:wne="http://schemas.microsoft.com/office/word/2006/wordml" xmlns:wps="http://schemas.microsoft.com/office/word/2010/wordprocessingShape" mc:Ignorable="w14 w15 w16se w16cid w16 w16cex w16sdtdh w16sdtfl w16du wp14">
   <w:endnote w:type="separator" w:id="-1">
     <w:p>
       <w:r>
@@ -301,7 +341,7 @@
 </file>
 
 <file path=word/footer1.xml><?xml version="1.0" encoding="utf-8"?>
-<w:ftr xmlns:wpc="http://schemas.microsoft.com/office/word/2010/wordprocessingCanvas" xmlns:cx="http://schemas.microsoft.com/office/drawing/2014/chartex" xmlns:cx1="http://schemas.microsoft.com/office/drawing/2015/9/8/chartex" xmlns:cx2="http://schemas.microsoft.com/office/drawing/2015/10/21/chartex" xmlns:cx3="http://schemas.microsoft.com/office/drawing/2016/5/9/chartex" xmlns:cx4="http://schemas.microsoft.com/office/drawing/2016/5/10/chartex" xmlns:cx5="http://schemas.microsoft.com/office/drawing/2016/5/11/chartex" xmlns:cx6="http://schemas.microsoft.com/office/drawing/2016/5/12/chartex" xmlns:cx7="http://schemas.microsoft.com/office/drawing/2016/5/13/chartex" xmlns:cx8="http://schemas.microsoft.com/office/drawing/2016/5/14/chartex" xmlns:mc="http://schemas.openxmlformats.org/markup-compatibility/2006" xmlns:aink="http://schemas.microsoft.com/office/drawing/2016/ink" xmlns:am3d="http://schemas.microsoft.com/office/drawing/2017/model3d" xmlns:o="urn:schemas-microsoft-com:office:office" xmlns:oel="http://schemas.microsoft.com/office/2019/extlst" xmlns:r="http://schemas.openxmlformats.org/officeDocument/2006/relationships" xmlns:m="http://schemas.openxmlformats.org/officeDocument/2006/math" xmlns:v="urn:schemas-microsoft-com:vml" xmlns:wp14="http://schemas.microsoft.com/office/word/2010/wordprocessingDrawing" xmlns:wp="http://schemas.openxmlformats.org/drawingml/2006/wordprocessingDrawing" xmlns:w10="urn:schemas-microsoft-com:office:word" xmlns:w="http://schemas.openxmlformats.org/wordprocessingml/2006/main" xmlns:w14="http://schemas.microsoft.com/office/word/2010/wordml" xmlns:w15="http://schemas.microsoft.com/office/word/2012/wordml" xmlns:w16cex="http://schemas.microsoft.com/office/word/2018/wordml/cex" xmlns:w16cid="http://schemas.microsoft.com/office/word/2016/wordml/cid" xmlns:w16="http://schemas.microsoft.com/office/word/2018/wordml" xmlns:w16du="http://schemas.microsoft.com/office/word/2023/wordml/word16du" xmlns:w16sdtdh="http://schemas.microsoft.com/office/word/2020/wordml/sdtdatahash" xmlns:w16se="http://schemas.microsoft.com/office/word/2015/wordml/symex" xmlns:wpg="http://schemas.microsoft.com/office/word/2010/wordprocessingGroup" xmlns:wpi="http://schemas.microsoft.com/office/word/2010/wordprocessingInk" xmlns:wne="http://schemas.microsoft.com/office/word/2006/wordml" xmlns:wps="http://schemas.microsoft.com/office/word/2010/wordprocessingShape" mc:Ignorable="w14 w15 w16se w16cid w16 w16cex w16sdtdh w16du wp14">
+<w:ftr xmlns:wpc="http://schemas.microsoft.com/office/word/2010/wordprocessingCanvas" xmlns:cx="http://schemas.microsoft.com/office/drawing/2014/chartex" xmlns:cx1="http://schemas.microsoft.com/office/drawing/2015/9/8/chartex" xmlns:cx2="http://schemas.microsoft.com/office/drawing/2015/10/21/chartex" xmlns:cx3="http://schemas.microsoft.com/office/drawing/2016/5/9/chartex" xmlns:cx4="http://schemas.microsoft.com/office/drawing/2016/5/10/chartex" xmlns:cx5="http://schemas.microsoft.com/office/drawing/2016/5/11/chartex" xmlns:cx6="http://schemas.microsoft.com/office/drawing/2016/5/12/chartex" xmlns:cx7="http://schemas.microsoft.com/office/drawing/2016/5/13/chartex" xmlns:cx8="http://schemas.microsoft.com/office/drawing/2016/5/14/chartex" xmlns:mc="http://schemas.openxmlformats.org/markup-compatibility/2006" xmlns:aink="http://schemas.microsoft.com/office/drawing/2016/ink" xmlns:am3d="http://schemas.microsoft.com/office/drawing/2017/model3d" xmlns:o="urn:schemas-microsoft-com:office:office" xmlns:oel="http://schemas.microsoft.com/office/2019/extlst" xmlns:r="http://schemas.openxmlformats.org/officeDocument/2006/relationships" xmlns:m="http://schemas.openxmlformats.org/officeDocument/2006/math" xmlns:v="urn:schemas-microsoft-com:vml" xmlns:wp14="http://schemas.microsoft.com/office/word/2010/wordprocessingDrawing" xmlns:wp="http://schemas.openxmlformats.org/drawingml/2006/wordprocessingDrawing" xmlns:w10="urn:schemas-microsoft-com:office:word" xmlns:w="http://schemas.openxmlformats.org/wordprocessingml/2006/main" xmlns:w14="http://schemas.microsoft.com/office/word/2010/wordml" xmlns:w15="http://schemas.microsoft.com/office/word/2012/wordml" xmlns:w16cex="http://schemas.microsoft.com/office/word/2018/wordml/cex" xmlns:w16cid="http://schemas.microsoft.com/office/word/2016/wordml/cid" xmlns:w16="http://schemas.microsoft.com/office/word/2018/wordml" xmlns:w16du="http://schemas.microsoft.com/office/word/2023/wordml/word16du" xmlns:w16sdtdh="http://schemas.microsoft.com/office/word/2020/wordml/sdtdatahash" xmlns:w16sdtfl="http://schemas.microsoft.com/office/word/2024/wordml/sdtformatlock" xmlns:w16se="http://schemas.microsoft.com/office/word/2015/wordml/symex" xmlns:wpg="http://schemas.microsoft.com/office/word/2010/wordprocessingGroup" xmlns:wpi="http://schemas.microsoft.com/office/word/2010/wordprocessingInk" xmlns:wne="http://schemas.microsoft.com/office/word/2006/wordml" xmlns:wps="http://schemas.microsoft.com/office/word/2010/wordprocessingShape" mc:Ignorable="w14 w15 w16se w16cid w16 w16cex w16sdtdh w16sdtfl w16du wp14">
   <w:p>
     <w:pPr>
       <w:pStyle w:val="Footer"/>
@@ -407,7 +447,7 @@
 </file>
 
 <file path=word/footnotes.xml><?xml version="1.0" encoding="utf-8"?>
-<w:footnotes xmlns:wpc="http://schemas.microsoft.com/office/word/2010/wordprocessingCanvas" xmlns:cx="http://schemas.microsoft.com/office/drawing/2014/chartex" xmlns:cx1="http://schemas.microsoft.com/office/drawing/2015/9/8/chartex" xmlns:cx2="http://schemas.microsoft.com/office/drawing/2015/10/21/chartex" xmlns:cx3="http://schemas.microsoft.com/office/drawing/2016/5/9/chartex" xmlns:cx4="http://schemas.microsoft.com/office/drawing/2016/5/10/chartex" xmlns:cx5="http://schemas.microsoft.com/office/drawing/2016/5/11/chartex" xmlns:cx6="http://schemas.microsoft.com/office/drawing/2016/5/12/chartex" xmlns:cx7="http://schemas.microsoft.com/office/drawing/2016/5/13/chartex" xmlns:cx8="http://schemas.microsoft.com/office/drawing/2016/5/14/chartex" xmlns:mc="http://schemas.openxmlformats.org/markup-compatibility/2006" xmlns:aink="http://schemas.microsoft.com/office/drawing/2016/ink" xmlns:am3d="http://schemas.microsoft.com/office/drawing/2017/model3d" xmlns:o="urn:schemas-microsoft-com:office:office" xmlns:oel="http://schemas.microsoft.com/office/2019/extlst" xmlns:r="http://schemas.openxmlformats.org/officeDocument/2006/relationships" xmlns:m="http://schemas.openxmlformats.org/officeDocument/2006/math" xmlns:v="urn:schemas-microsoft-com:vml" xmlns:wp14="http://schemas.microsoft.com/office/word/2010/wordprocessingDrawing" xmlns:wp="http://schemas.openxmlformats.org/drawingml/2006/wordprocessingDrawing" xmlns:w10="urn:schemas-microsoft-com:office:word" xmlns:w="http://schemas.openxmlformats.org/wordprocessingml/2006/main" xmlns:w14="http://schemas.microsoft.com/office/word/2010/wordml" xmlns:w15="http://schemas.microsoft.com/office/word/2012/wordml" xmlns:w16cex="http://schemas.microsoft.com/office/word/2018/wordml/cex" xmlns:w16cid="http://schemas.microsoft.com/office/word/2016/wordml/cid" xmlns:w16="http://schemas.microsoft.com/office/word/2018/wordml" xmlns:w16du="http://schemas.microsoft.com/office/word/2023/wordml/word16du" xmlns:w16sdtdh="http://schemas.microsoft.com/office/word/2020/wordml/sdtdatahash" xmlns:w16se="http://schemas.microsoft.com/office/word/2015/wordml/symex" xmlns:wpg="http://schemas.microsoft.com/office/word/2010/wordprocessingGroup" xmlns:wpi="http://schemas.microsoft.com/office/word/2010/wordprocessingInk" xmlns:wne="http://schemas.microsoft.com/office/word/2006/wordml" xmlns:wps="http://schemas.microsoft.com/office/word/2010/wordprocessingShape" mc:Ignorable="w14 w15 w16se w16cid w16 w16cex w16sdtdh w16du wp14">
+<w:footnotes xmlns:wpc="http://schemas.microsoft.com/office/word/2010/wordprocessingCanvas" xmlns:cx="http://schemas.microsoft.com/office/drawing/2014/chartex" xmlns:cx1="http://schemas.microsoft.com/office/drawing/2015/9/8/chartex" xmlns:cx2="http://schemas.microsoft.com/office/drawing/2015/10/21/chartex" xmlns:cx3="http://schemas.microsoft.com/office/drawing/2016/5/9/chartex" xmlns:cx4="http://schemas.microsoft.com/office/drawing/2016/5/10/chartex" xmlns:cx5="http://schemas.microsoft.com/office/drawing/2016/5/11/chartex" xmlns:cx6="http://schemas.microsoft.com/office/drawing/2016/5/12/chartex" xmlns:cx7="http://schemas.microsoft.com/office/drawing/2016/5/13/chartex" xmlns:cx8="http://schemas.microsoft.com/office/drawing/2016/5/14/chartex" xmlns:mc="http://schemas.openxmlformats.org/markup-compatibility/2006" xmlns:aink="http://schemas.microsoft.com/office/drawing/2016/ink" xmlns:am3d="http://schemas.microsoft.com/office/drawing/2017/model3d" xmlns:o="urn:schemas-microsoft-com:office:office" xmlns:oel="http://schemas.microsoft.com/office/2019/extlst" xmlns:r="http://schemas.openxmlformats.org/officeDocument/2006/relationships" xmlns:m="http://schemas.openxmlformats.org/officeDocument/2006/math" xmlns:v="urn:schemas-microsoft-com:vml" xmlns:wp14="http://schemas.microsoft.com/office/word/2010/wordprocessingDrawing" xmlns:wp="http://schemas.openxmlformats.org/drawingml/2006/wordprocessingDrawing" xmlns:w10="urn:schemas-microsoft-com:office:word" xmlns:w="http://schemas.openxmlformats.org/wordprocessingml/2006/main" xmlns:w14="http://schemas.microsoft.com/office/word/2010/wordml" xmlns:w15="http://schemas.microsoft.com/office/word/2012/wordml" xmlns:w16cex="http://schemas.microsoft.com/office/word/2018/wordml/cex" xmlns:w16cid="http://schemas.microsoft.com/office/word/2016/wordml/cid" xmlns:w16="http://schemas.microsoft.com/office/word/2018/wordml" xmlns:w16du="http://schemas.microsoft.com/office/word/2023/wordml/word16du" xmlns:w16sdtdh="http://schemas.microsoft.com/office/word/2020/wordml/sdtdatahash" xmlns:w16sdtfl="http://schemas.microsoft.com/office/word/2024/wordml/sdtformatlock" xmlns:w16se="http://schemas.microsoft.com/office/word/2015/wordml/symex" xmlns:wpg="http://schemas.microsoft.com/office/word/2010/wordprocessingGroup" xmlns:wpi="http://schemas.microsoft.com/office/word/2010/wordprocessingInk" xmlns:wne="http://schemas.microsoft.com/office/word/2006/wordml" xmlns:wps="http://schemas.microsoft.com/office/word/2010/wordprocessingShape" mc:Ignorable="w14 w15 w16se w16cid w16 w16cex w16sdtdh w16sdtfl w16du wp14">
   <w:footnote w:type="separator" w:id="-1">
     <w:p>
       <w:r>
@@ -426,7 +466,7 @@
 </file>
 
 <file path=word/header1.xml><?xml version="1.0" encoding="utf-8"?>
-<w:hdr xmlns:wpc="http://schemas.microsoft.com/office/word/2010/wordprocessingCanvas" xmlns:cx="http://schemas.microsoft.com/office/drawing/2014/chartex" xmlns:cx1="http://schemas.microsoft.com/office/drawing/2015/9/8/chartex" xmlns:cx2="http://schemas.microsoft.com/office/drawing/2015/10/21/chartex" xmlns:cx3="http://schemas.microsoft.com/office/drawing/2016/5/9/chartex" xmlns:cx4="http://schemas.microsoft.com/office/drawing/2016/5/10/chartex" xmlns:cx5="http://schemas.microsoft.com/office/drawing/2016/5/11/chartex" xmlns:cx6="http://schemas.microsoft.com/office/drawing/2016/5/12/chartex" xmlns:cx7="http://schemas.microsoft.com/office/drawing/2016/5/13/chartex" xmlns:cx8="http://schemas.microsoft.com/office/drawing/2016/5/14/chartex" xmlns:mc="http://schemas.openxmlformats.org/markup-compatibility/2006" xmlns:aink="http://schemas.microsoft.com/office/drawing/2016/ink" xmlns:am3d="http://schemas.microsoft.com/office/drawing/2017/model3d" xmlns:o="urn:schemas-microsoft-com:office:office" xmlns:oel="http://schemas.microsoft.com/office/2019/extlst" xmlns:r="http://schemas.openxmlformats.org/officeDocument/2006/relationships" xmlns:m="http://schemas.openxmlformats.org/officeDocument/2006/math" xmlns:v="urn:schemas-microsoft-com:vml" xmlns:wp14="http://schemas.microsoft.com/office/word/2010/wordprocessingDrawing" xmlns:wp="http://schemas.openxmlformats.org/drawingml/2006/wordprocessingDrawing" xmlns:w10="urn:schemas-microsoft-com:office:word" xmlns:w="http://schemas.openxmlformats.org/wordprocessingml/2006/main" xmlns:w14="http://schemas.microsoft.com/office/word/2010/wordml" xmlns:w15="http://schemas.microsoft.com/office/word/2012/wordml" xmlns:w16cex="http://schemas.microsoft.com/office/word/2018/wordml/cex" xmlns:w16cid="http://schemas.microsoft.com/office/word/2016/wordml/cid" xmlns:w16="http://schemas.microsoft.com/office/word/2018/wordml" xmlns:w16du="http://schemas.microsoft.com/office/word/2023/wordml/word16du" xmlns:w16sdtdh="http://schemas.microsoft.com/office/word/2020/wordml/sdtdatahash" xmlns:w16se="http://schemas.microsoft.com/office/word/2015/wordml/symex" xmlns:wpg="http://schemas.microsoft.com/office/word/2010/wordprocessingGroup" xmlns:wpi="http://schemas.microsoft.com/office/word/2010/wordprocessingInk" xmlns:wne="http://schemas.microsoft.com/office/word/2006/wordml" xmlns:wps="http://schemas.microsoft.com/office/word/2010/wordprocessingShape" mc:Ignorable="w14 w15 w16se w16cid w16 w16cex w16sdtdh w16du wp14">
+<w:hdr xmlns:wpc="http://schemas.microsoft.com/office/word/2010/wordprocessingCanvas" xmlns:cx="http://schemas.microsoft.com/office/drawing/2014/chartex" xmlns:cx1="http://schemas.microsoft.com/office/drawing/2015/9/8/chartex" xmlns:cx2="http://schemas.microsoft.com/office/drawing/2015/10/21/chartex" xmlns:cx3="http://schemas.microsoft.com/office/drawing/2016/5/9/chartex" xmlns:cx4="http://schemas.microsoft.com/office/drawing/2016/5/10/chartex" xmlns:cx5="http://schemas.microsoft.com/office/drawing/2016/5/11/chartex" xmlns:cx6="http://schemas.microsoft.com/office/drawing/2016/5/12/chartex" xmlns:cx7="http://schemas.microsoft.com/office/drawing/2016/5/13/chartex" xmlns:cx8="http://schemas.microsoft.com/office/drawing/2016/5/14/chartex" xmlns:mc="http://schemas.openxmlformats.org/markup-compatibility/2006" xmlns:aink="http://schemas.microsoft.com/office/drawing/2016/ink" xmlns:am3d="http://schemas.microsoft.com/office/drawing/2017/model3d" xmlns:o="urn:schemas-microsoft-com:office:office" xmlns:oel="http://schemas.microsoft.com/office/2019/extlst" xmlns:r="http://schemas.openxmlformats.org/officeDocument/2006/relationships" xmlns:m="http://schemas.openxmlformats.org/officeDocument/2006/math" xmlns:v="urn:schemas-microsoft-com:vml" xmlns:wp14="http://schemas.microsoft.com/office/word/2010/wordprocessingDrawing" xmlns:wp="http://schemas.openxmlformats.org/drawingml/2006/wordprocessingDrawing" xmlns:w10="urn:schemas-microsoft-com:office:word" xmlns:w="http://schemas.openxmlformats.org/wordprocessingml/2006/main" xmlns:w14="http://schemas.microsoft.com/office/word/2010/wordml" xmlns:w15="http://schemas.microsoft.com/office/word/2012/wordml" xmlns:w16cex="http://schemas.microsoft.com/office/word/2018/wordml/cex" xmlns:w16cid="http://schemas.microsoft.com/office/word/2016/wordml/cid" xmlns:w16="http://schemas.microsoft.com/office/word/2018/wordml" xmlns:w16du="http://schemas.microsoft.com/office/word/2023/wordml/word16du" xmlns:w16sdtdh="http://schemas.microsoft.com/office/word/2020/wordml/sdtdatahash" xmlns:w16sdtfl="http://schemas.microsoft.com/office/word/2024/wordml/sdtformatlock" xmlns:w16se="http://schemas.microsoft.com/office/word/2015/wordml/symex" xmlns:wpg="http://schemas.microsoft.com/office/word/2010/wordprocessingGroup" xmlns:wpi="http://schemas.microsoft.com/office/word/2010/wordprocessingInk" xmlns:wne="http://schemas.microsoft.com/office/word/2006/wordml" xmlns:wps="http://schemas.microsoft.com/office/word/2010/wordprocessingShape" mc:Ignorable="w14 w15 w16se w16cid w16 w16cex w16sdtdh w16sdtfl w16du wp14">
   <w:p>
     <w:pPr>
       <w:spacing w:before="100" w:beforeAutospacing="1" w:after="100" w:afterAutospacing="1"/>
@@ -462,7 +502,7 @@
 </file>
 
 <file path=word/numbering.xml><?xml version="1.0" encoding="utf-8"?>
-<w:numbering xmlns:wpc="http://schemas.microsoft.com/office/word/2010/wordprocessingCanvas" xmlns:cx="http://schemas.microsoft.com/office/drawing/2014/chartex" xmlns:cx1="http://schemas.microsoft.com/office/drawing/2015/9/8/chartex" xmlns:cx2="http://schemas.microsoft.com/office/drawing/2015/10/21/chartex" xmlns:cx3="http://schemas.microsoft.com/office/drawing/2016/5/9/chartex" xmlns:cx4="http://schemas.microsoft.com/office/drawing/2016/5/10/chartex" xmlns:cx5="http://schemas.microsoft.com/office/drawing/2016/5/11/chartex" xmlns:cx6="http://schemas.microsoft.com/office/drawing/2016/5/12/chartex" xmlns:cx7="http://schemas.microsoft.com/office/drawing/2016/5/13/chartex" xmlns:cx8="http://schemas.microsoft.com/office/drawing/2016/5/14/chartex" xmlns:mc="http://schemas.openxmlformats.org/markup-compatibility/2006" xmlns:aink="http://schemas.microsoft.com/office/drawing/2016/ink" xmlns:am3d="http://schemas.microsoft.com/office/drawing/2017/model3d" xmlns:o="urn:schemas-microsoft-com:office:office" xmlns:oel="http://schemas.microsoft.com/office/2019/extlst" xmlns:r="http://schemas.openxmlformats.org/officeDocument/2006/relationships" xmlns:m="http://schemas.openxmlformats.org/officeDocument/2006/math" xmlns:v="urn:schemas-microsoft-com:vml" xmlns:wp14="http://schemas.microsoft.com/office/word/2010/wordprocessingDrawing" xmlns:wp="http://schemas.openxmlformats.org/drawingml/2006/wordprocessingDrawing" xmlns:w10="urn:schemas-microsoft-com:office:word" xmlns:w="http://schemas.openxmlformats.org/wordprocessingml/2006/main" xmlns:w14="http://schemas.microsoft.com/office/word/2010/wordml" xmlns:w15="http://schemas.microsoft.com/office/word/2012/wordml" xmlns:w16cex="http://schemas.microsoft.com/office/word/2018/wordml/cex" xmlns:w16cid="http://schemas.microsoft.com/office/word/2016/wordml/cid" xmlns:w16="http://schemas.microsoft.com/office/word/2018/wordml" xmlns:w16du="http://schemas.microsoft.com/office/word/2023/wordml/word16du" xmlns:w16sdtdh="http://schemas.microsoft.com/office/word/2020/wordml/sdtdatahash" xmlns:w16se="http://schemas.microsoft.com/office/word/2015/wordml/symex" xmlns:wpg="http://schemas.microsoft.com/office/word/2010/wordprocessingGroup" xmlns:wpi="http://schemas.microsoft.com/office/word/2010/wordprocessingInk" xmlns:wne="http://schemas.microsoft.com/office/word/2006/wordml" xmlns:wps="http://schemas.microsoft.com/office/word/2010/wordprocessingShape" mc:Ignorable="w14 w15 w16se w16cid w16 w16cex w16sdtdh w16du wp14">
+<w:numbering xmlns:wpc="http://schemas.microsoft.com/office/word/2010/wordprocessingCanvas" xmlns:cx="http://schemas.microsoft.com/office/drawing/2014/chartex" xmlns:cx1="http://schemas.microsoft.com/office/drawing/2015/9/8/chartex" xmlns:cx2="http://schemas.microsoft.com/office/drawing/2015/10/21/chartex" xmlns:cx3="http://schemas.microsoft.com/office/drawing/2016/5/9/chartex" xmlns:cx4="http://schemas.microsoft.com/office/drawing/2016/5/10/chartex" xmlns:cx5="http://schemas.microsoft.com/office/drawing/2016/5/11/chartex" xmlns:cx6="http://schemas.microsoft.com/office/drawing/2016/5/12/chartex" xmlns:cx7="http://schemas.microsoft.com/office/drawing/2016/5/13/chartex" xmlns:cx8="http://schemas.microsoft.com/office/drawing/2016/5/14/chartex" xmlns:mc="http://schemas.openxmlformats.org/markup-compatibility/2006" xmlns:aink="http://schemas.microsoft.com/office/drawing/2016/ink" xmlns:am3d="http://schemas.microsoft.com/office/drawing/2017/model3d" xmlns:o="urn:schemas-microsoft-com:office:office" xmlns:oel="http://schemas.microsoft.com/office/2019/extlst" xmlns:r="http://schemas.openxmlformats.org/officeDocument/2006/relationships" xmlns:m="http://schemas.openxmlformats.org/officeDocument/2006/math" xmlns:v="urn:schemas-microsoft-com:vml" xmlns:wp14="http://schemas.microsoft.com/office/word/2010/wordprocessingDrawing" xmlns:wp="http://schemas.openxmlformats.org/drawingml/2006/wordprocessingDrawing" xmlns:w10="urn:schemas-microsoft-com:office:word" xmlns:w="http://schemas.openxmlformats.org/wordprocessingml/2006/main" xmlns:w14="http://schemas.microsoft.com/office/word/2010/wordml" xmlns:w15="http://schemas.microsoft.com/office/word/2012/wordml" xmlns:w16cex="http://schemas.microsoft.com/office/word/2018/wordml/cex" xmlns:w16cid="http://schemas.microsoft.com/office/word/2016/wordml/cid" xmlns:w16="http://schemas.microsoft.com/office/word/2018/wordml" xmlns:w16du="http://schemas.microsoft.com/office/word/2023/wordml/word16du" xmlns:w16sdtdh="http://schemas.microsoft.com/office/word/2020/wordml/sdtdatahash" xmlns:w16sdtfl="http://schemas.microsoft.com/office/word/2024/wordml/sdtformatlock" xmlns:w16se="http://schemas.microsoft.com/office/word/2015/wordml/symex" xmlns:wpg="http://schemas.microsoft.com/office/word/2010/wordprocessingGroup" xmlns:wpi="http://schemas.microsoft.com/office/word/2010/wordprocessingInk" xmlns:wne="http://schemas.microsoft.com/office/word/2006/wordml" xmlns:wps="http://schemas.microsoft.com/office/word/2010/wordprocessingShape" mc:Ignorable="w14 w15 w16se w16cid w16 w16cex w16sdtdh w16sdtfl w16du wp14">
   <w:abstractNum w:abstractNumId="0" w15:restartNumberingAfterBreak="0">
     <w:nsid w:val="FFFFFF7C"/>
     <w:multiLevelType w:val="singleLevel"/>
@@ -4638,7 +4678,7 @@
 </file>
 
 <file path=word/styles.xml><?xml version="1.0" encoding="utf-8"?>
-<w:styles xmlns:mc="http://schemas.openxmlformats.org/markup-compatibility/2006" xmlns:r="http://schemas.openxmlformats.org/officeDocument/2006/relationships" xmlns:w="http://schemas.openxmlformats.org/wordprocessingml/2006/main" xmlns:w14="http://schemas.microsoft.com/office/word/2010/wordml" xmlns:w15="http://schemas.microsoft.com/office/word/2012/wordml" xmlns:w16cex="http://schemas.microsoft.com/office/word/2018/wordml/cex" xmlns:w16cid="http://schemas.microsoft.com/office/word/2016/wordml/cid" xmlns:w16="http://schemas.microsoft.com/office/word/2018/wordml" xmlns:w16du="http://schemas.microsoft.com/office/word/2023/wordml/word16du" xmlns:w16sdtdh="http://schemas.microsoft.com/office/word/2020/wordml/sdtdatahash" xmlns:w16se="http://schemas.microsoft.com/office/word/2015/wordml/symex" mc:Ignorable="w14 w15 w16se w16cid w16 w16cex w16sdtdh w16du">
+<w:styles xmlns:mc="http://schemas.openxmlformats.org/markup-compatibility/2006" xmlns:r="http://schemas.openxmlformats.org/officeDocument/2006/relationships" xmlns:w="http://schemas.openxmlformats.org/wordprocessingml/2006/main" xmlns:w14="http://schemas.microsoft.com/office/word/2010/wordml" xmlns:w15="http://schemas.microsoft.com/office/word/2012/wordml" xmlns:w16cex="http://schemas.microsoft.com/office/word/2018/wordml/cex" xmlns:w16cid="http://schemas.microsoft.com/office/word/2016/wordml/cid" xmlns:w16="http://schemas.microsoft.com/office/word/2018/wordml" xmlns:w16du="http://schemas.microsoft.com/office/word/2023/wordml/word16du" xmlns:w16sdtdh="http://schemas.microsoft.com/office/word/2020/wordml/sdtdatahash" xmlns:w16sdtfl="http://schemas.microsoft.com/office/word/2024/wordml/sdtformatlock" xmlns:w16se="http://schemas.microsoft.com/office/word/2015/wordml/symex" mc:Ignorable="w14 w15 w16se w16cid w16 w16cex w16sdtdh w16sdtfl w16du">
   <w:docDefaults>
     <w:rPrDefault>
       <w:rPr>
@@ -7281,16 +7321,16 @@
 <file path=customXml/itemProps3.xml><?xml version="1.0" encoding="utf-8"?>
 <ds:datastoreItem xmlns:ds="http://schemas.openxmlformats.org/officeDocument/2006/customXml" ds:itemID="{0A0FCBE2-3933-4F7C-A561-63CD9E116756}">
   <ds:schemaRefs>
-    <ds:schemaRef ds:uri="http://purl.org/dc/dcmitype/"/>
-    <ds:schemaRef ds:uri="http://schemas.microsoft.com/office/2006/documentManagement/types"/>
-    <ds:schemaRef ds:uri="http://purl.org/dc/terms/"/>
+    <ds:schemaRef ds:uri="http://schemas.microsoft.com/office/2006/metadata/properties"/>
+    <ds:schemaRef ds:uri="http://schemas.microsoft.com/office/infopath/2007/PartnerControls"/>
     <ds:schemaRef ds:uri="9c51eeb5-5963-44c1-92d3-ec1f6df1cdfd"/>
-    <ds:schemaRef ds:uri="http://schemas.microsoft.com/office/infopath/2007/PartnerControls"/>
-    <ds:schemaRef ds:uri="http://www.w3.org/XML/1998/namespace"/>
-    <ds:schemaRef ds:uri="http://schemas.microsoft.com/office/2006/metadata/properties"/>
-    <ds:schemaRef ds:uri="http://schemas.openxmlformats.org/package/2006/metadata/core-properties"/>
     <ds:schemaRef ds:uri="8c7dc7f3-a840-475f-a519-c4715494a580"/>
-    <ds:schemaRef ds:uri="http://purl.org/dc/elements/1.1/"/>
   </ds:schemaRefs>
 </ds:datastoreItem>
+</file>
+
+<file path=docMetadata/LabelInfo.xml><?xml version="1.0" encoding="utf-8"?>
+<clbl:labelList xmlns:clbl="http://schemas.microsoft.com/office/2020/mipLabelMetadata">
+  <clbl:label id="{7515d511-864d-4668-b936-bee455c23755}" enabled="1" method="Standard" siteId="{af1a7dbf-c35d-4554-83b4-aad0f8572e87}" contentBits="0" removed="0"/>
+</clbl:labelList>
 </file>
</xml_diff>